<commit_message>
Integrated and tested MySQL database with Spring Boot backend
</commit_message>
<xml_diff>
--- a/documentation/RawDocumentationOfProject.docx
+++ b/documentation/RawDocumentationOfProject.docx
@@ -12003,6 +12003,1779 @@
         <w:t>This phase establishes the intelligent prediction service that will later integrate with the Spring Boot backend and frontend application.</w:t>
       </w:r>
     </w:p>
+    <w:p>
+      <w:r>
+        <w:lastRenderedPageBreak/>
+        <w:t>Step 7 — Spring Boot Backend Development</w:t>
+      </w:r>
+    </w:p>
+    <w:p/>
+    <w:p>
+      <w:r>
+        <w:t>1. Introduction</w:t>
+      </w:r>
+    </w:p>
+    <w:p/>
+    <w:p>
+      <w:r>
+        <w:t>In this phase, the Spring Boot backend system for the AI-Based Artery Blockage Prediction System was successfully developed. The backend acts as the central controller between the frontend/user interface and the Flask Machine Learning API. The purpose of this phase was to create a structured backend architecture capable of handling user requests, validating patient data, communicating with the Machine Learning prediction engine, processing prediction responses, and preparing the system for future database integration.</w:t>
+      </w:r>
+    </w:p>
+    <w:p/>
+    <w:p>
+      <w:r>
+        <w:t>The backend was developed using Java 21 and Spring Boot framework following a layered architecture approach to improve maintainability, scalability, and separation of concerns.</w:t>
+      </w:r>
+    </w:p>
+    <w:p/>
+    <w:p>
+      <w:r>
+        <w:t>________________________________________</w:t>
+      </w:r>
+    </w:p>
+    <w:p/>
+    <w:p>
+      <w:r>
+        <w:t>2. Backend Architecture Design</w:t>
+      </w:r>
+    </w:p>
+    <w:p/>
+    <w:p>
+      <w:r>
+        <w:t>A clean layered backend architecture was created for the system. Separate packages were developed for handling different backend responsibilities.</w:t>
+      </w:r>
+    </w:p>
+    <w:p/>
+    <w:p>
+      <w:r>
+        <w:t>The following packages were created:</w:t>
+      </w:r>
+    </w:p>
+    <w:p/>
+    <w:p>
+      <w:r>
+        <w:t>•</w:t>
+      </w:r>
+      <w:r>
+        <w:tab/>
+      </w:r>
+      <w:proofErr w:type="gramStart"/>
+      <w:r>
+        <w:t>controller</w:t>
+      </w:r>
+      <w:proofErr w:type="gramEnd"/>
+    </w:p>
+    <w:p>
+      <w:r>
+        <w:t>•</w:t>
+      </w:r>
+      <w:r>
+        <w:tab/>
+      </w:r>
+      <w:proofErr w:type="gramStart"/>
+      <w:r>
+        <w:t>service</w:t>
+      </w:r>
+      <w:proofErr w:type="gramEnd"/>
+    </w:p>
+    <w:p>
+      <w:r>
+        <w:t>•</w:t>
+      </w:r>
+      <w:r>
+        <w:tab/>
+      </w:r>
+      <w:proofErr w:type="spellStart"/>
+      <w:proofErr w:type="gramStart"/>
+      <w:r>
+        <w:t>dto</w:t>
+      </w:r>
+      <w:proofErr w:type="spellEnd"/>
+      <w:proofErr w:type="gramEnd"/>
+    </w:p>
+    <w:p>
+      <w:r>
+        <w:t>•</w:t>
+      </w:r>
+      <w:r>
+        <w:tab/>
+      </w:r>
+      <w:proofErr w:type="gramStart"/>
+      <w:r>
+        <w:t>client</w:t>
+      </w:r>
+      <w:proofErr w:type="gramEnd"/>
+    </w:p>
+    <w:p>
+      <w:r>
+        <w:t>•</w:t>
+      </w:r>
+      <w:r>
+        <w:tab/>
+      </w:r>
+      <w:proofErr w:type="spellStart"/>
+      <w:proofErr w:type="gramStart"/>
+      <w:r>
+        <w:t>config</w:t>
+      </w:r>
+      <w:proofErr w:type="spellEnd"/>
+      <w:proofErr w:type="gramEnd"/>
+    </w:p>
+    <w:p>
+      <w:r>
+        <w:t>•</w:t>
+      </w:r>
+      <w:r>
+        <w:tab/>
+      </w:r>
+      <w:proofErr w:type="gramStart"/>
+      <w:r>
+        <w:t>repository</w:t>
+      </w:r>
+      <w:proofErr w:type="gramEnd"/>
+    </w:p>
+    <w:p>
+      <w:r>
+        <w:t>•</w:t>
+      </w:r>
+      <w:r>
+        <w:tab/>
+      </w:r>
+      <w:proofErr w:type="gramStart"/>
+      <w:r>
+        <w:t>model</w:t>
+      </w:r>
+      <w:proofErr w:type="gramEnd"/>
+    </w:p>
+    <w:p/>
+    <w:p>
+      <w:r>
+        <w:lastRenderedPageBreak/>
+        <w:t>Purpose of Each Package:</w:t>
+      </w:r>
+    </w:p>
+    <w:p/>
+    <w:p>
+      <w:r>
+        <w:t>•</w:t>
+      </w:r>
+      <w:r>
+        <w:tab/>
+      </w:r>
+      <w:proofErr w:type="gramStart"/>
+      <w:r>
+        <w:t>controller</w:t>
+      </w:r>
+      <w:proofErr w:type="gramEnd"/>
+      <w:r>
+        <w:t xml:space="preserve"> → Handles REST API endpoints and request mapping.</w:t>
+      </w:r>
+    </w:p>
+    <w:p>
+      <w:r>
+        <w:t>•</w:t>
+      </w:r>
+      <w:r>
+        <w:tab/>
+      </w:r>
+      <w:proofErr w:type="gramStart"/>
+      <w:r>
+        <w:t>service</w:t>
+      </w:r>
+      <w:proofErr w:type="gramEnd"/>
+      <w:r>
+        <w:t xml:space="preserve"> → Contains backend business logic and processing.</w:t>
+      </w:r>
+    </w:p>
+    <w:p>
+      <w:r>
+        <w:t>•</w:t>
+      </w:r>
+      <w:r>
+        <w:tab/>
+      </w:r>
+      <w:proofErr w:type="spellStart"/>
+      <w:proofErr w:type="gramStart"/>
+      <w:r>
+        <w:t>dto</w:t>
+      </w:r>
+      <w:proofErr w:type="spellEnd"/>
+      <w:proofErr w:type="gramEnd"/>
+      <w:r>
+        <w:t xml:space="preserve"> → Stores request and response transfer objects.</w:t>
+      </w:r>
+    </w:p>
+    <w:p>
+      <w:r>
+        <w:t>•</w:t>
+      </w:r>
+      <w:r>
+        <w:tab/>
+      </w:r>
+      <w:proofErr w:type="gramStart"/>
+      <w:r>
+        <w:t>client</w:t>
+      </w:r>
+      <w:proofErr w:type="gramEnd"/>
+      <w:r>
+        <w:t xml:space="preserve"> → Handles communication with Flask ML API.</w:t>
+      </w:r>
+    </w:p>
+    <w:p>
+      <w:r>
+        <w:t>•</w:t>
+      </w:r>
+      <w:r>
+        <w:tab/>
+      </w:r>
+      <w:proofErr w:type="spellStart"/>
+      <w:proofErr w:type="gramStart"/>
+      <w:r>
+        <w:t>config</w:t>
+      </w:r>
+      <w:proofErr w:type="spellEnd"/>
+      <w:proofErr w:type="gramEnd"/>
+      <w:r>
+        <w:t xml:space="preserve"> → Stores backend configuration-related components.</w:t>
+      </w:r>
+    </w:p>
+    <w:p>
+      <w:r>
+        <w:t>•</w:t>
+      </w:r>
+      <w:r>
+        <w:tab/>
+      </w:r>
+      <w:proofErr w:type="gramStart"/>
+      <w:r>
+        <w:t>repository</w:t>
+      </w:r>
+      <w:proofErr w:type="gramEnd"/>
+      <w:r>
+        <w:t xml:space="preserve"> → Reserved for future database integration.</w:t>
+      </w:r>
+    </w:p>
+    <w:p>
+      <w:r>
+        <w:t>•</w:t>
+      </w:r>
+      <w:r>
+        <w:tab/>
+      </w:r>
+      <w:proofErr w:type="gramStart"/>
+      <w:r>
+        <w:t>model</w:t>
+      </w:r>
+      <w:proofErr w:type="gramEnd"/>
+      <w:r>
+        <w:t xml:space="preserve"> → Contains backend model/entity classes.</w:t>
+      </w:r>
+    </w:p>
+    <w:p/>
+    <w:p>
+      <w:r>
+        <w:t>This architecture improves code organization and allows future expansion of the system.</w:t>
+      </w:r>
+    </w:p>
+    <w:p/>
+    <w:p>
+      <w:r>
+        <w:t>________________________________________</w:t>
+      </w:r>
+    </w:p>
+    <w:p/>
+    <w:p>
+      <w:r>
+        <w:t>3. DTO Layer Development</w:t>
+      </w:r>
+    </w:p>
+    <w:p/>
+    <w:p>
+      <w:r>
+        <w:t>DTO (Data Transfer Object) classes were developed to manage structured request and response handling between Spring Boot backend and Flask Machine Learning API.</w:t>
+      </w:r>
+    </w:p>
+    <w:p/>
+    <w:p>
+      <w:r>
+        <w:t>The following DTO classes were created:</w:t>
+      </w:r>
+    </w:p>
+    <w:p/>
+    <w:p>
+      <w:r>
+        <w:t>•</w:t>
+      </w:r>
+      <w:r>
+        <w:tab/>
+        <w:t>PredictionRequest.java</w:t>
+      </w:r>
+    </w:p>
+    <w:p>
+      <w:r>
+        <w:t>•</w:t>
+      </w:r>
+      <w:r>
+        <w:tab/>
+        <w:t>PredictionResponse.java</w:t>
+      </w:r>
+    </w:p>
+    <w:p/>
+    <w:p>
+      <w:r>
+        <w:t>PredictionRequest.java stores patient medical parameters including:</w:t>
+      </w:r>
+    </w:p>
+    <w:p/>
+    <w:p>
+      <w:r>
+        <w:t>•</w:t>
+      </w:r>
+      <w:r>
+        <w:tab/>
+      </w:r>
+      <w:proofErr w:type="gramStart"/>
+      <w:r>
+        <w:t>age</w:t>
+      </w:r>
+      <w:proofErr w:type="gramEnd"/>
+    </w:p>
+    <w:p>
+      <w:r>
+        <w:t>•</w:t>
+      </w:r>
+      <w:r>
+        <w:tab/>
+      </w:r>
+      <w:proofErr w:type="gramStart"/>
+      <w:r>
+        <w:t>sex</w:t>
+      </w:r>
+      <w:proofErr w:type="gramEnd"/>
+    </w:p>
+    <w:p>
+      <w:r>
+        <w:t>•</w:t>
+      </w:r>
+      <w:r>
+        <w:tab/>
+      </w:r>
+      <w:proofErr w:type="spellStart"/>
+      <w:proofErr w:type="gramStart"/>
+      <w:r>
+        <w:t>cp</w:t>
+      </w:r>
+      <w:proofErr w:type="spellEnd"/>
+      <w:proofErr w:type="gramEnd"/>
+    </w:p>
+    <w:p>
+      <w:r>
+        <w:lastRenderedPageBreak/>
+        <w:t>•</w:t>
+      </w:r>
+      <w:r>
+        <w:tab/>
+      </w:r>
+      <w:proofErr w:type="spellStart"/>
+      <w:proofErr w:type="gramStart"/>
+      <w:r>
+        <w:t>trestbps</w:t>
+      </w:r>
+      <w:proofErr w:type="spellEnd"/>
+      <w:proofErr w:type="gramEnd"/>
+    </w:p>
+    <w:p>
+      <w:r>
+        <w:t>•</w:t>
+      </w:r>
+      <w:r>
+        <w:tab/>
+      </w:r>
+      <w:proofErr w:type="spellStart"/>
+      <w:proofErr w:type="gramStart"/>
+      <w:r>
+        <w:t>chol</w:t>
+      </w:r>
+      <w:proofErr w:type="spellEnd"/>
+      <w:proofErr w:type="gramEnd"/>
+    </w:p>
+    <w:p>
+      <w:r>
+        <w:t>•</w:t>
+      </w:r>
+      <w:r>
+        <w:tab/>
+      </w:r>
+      <w:proofErr w:type="spellStart"/>
+      <w:proofErr w:type="gramStart"/>
+      <w:r>
+        <w:t>fbs</w:t>
+      </w:r>
+      <w:proofErr w:type="spellEnd"/>
+      <w:proofErr w:type="gramEnd"/>
+    </w:p>
+    <w:p>
+      <w:r>
+        <w:t>•</w:t>
+      </w:r>
+      <w:r>
+        <w:tab/>
+      </w:r>
+      <w:proofErr w:type="spellStart"/>
+      <w:proofErr w:type="gramStart"/>
+      <w:r>
+        <w:t>restecg</w:t>
+      </w:r>
+      <w:proofErr w:type="spellEnd"/>
+      <w:proofErr w:type="gramEnd"/>
+    </w:p>
+    <w:p>
+      <w:r>
+        <w:t>•</w:t>
+      </w:r>
+      <w:r>
+        <w:tab/>
+      </w:r>
+      <w:proofErr w:type="spellStart"/>
+      <w:proofErr w:type="gramStart"/>
+      <w:r>
+        <w:t>thalach</w:t>
+      </w:r>
+      <w:proofErr w:type="spellEnd"/>
+      <w:proofErr w:type="gramEnd"/>
+    </w:p>
+    <w:p>
+      <w:r>
+        <w:t>•</w:t>
+      </w:r>
+      <w:r>
+        <w:tab/>
+      </w:r>
+      <w:proofErr w:type="spellStart"/>
+      <w:proofErr w:type="gramStart"/>
+      <w:r>
+        <w:t>exang</w:t>
+      </w:r>
+      <w:proofErr w:type="spellEnd"/>
+      <w:proofErr w:type="gramEnd"/>
+    </w:p>
+    <w:p>
+      <w:r>
+        <w:t>•</w:t>
+      </w:r>
+      <w:r>
+        <w:tab/>
+      </w:r>
+      <w:proofErr w:type="spellStart"/>
+      <w:proofErr w:type="gramStart"/>
+      <w:r>
+        <w:t>oldpeak</w:t>
+      </w:r>
+      <w:proofErr w:type="spellEnd"/>
+      <w:proofErr w:type="gramEnd"/>
+    </w:p>
+    <w:p>
+      <w:r>
+        <w:t>•</w:t>
+      </w:r>
+      <w:r>
+        <w:tab/>
+      </w:r>
+      <w:proofErr w:type="gramStart"/>
+      <w:r>
+        <w:t>slope</w:t>
+      </w:r>
+      <w:proofErr w:type="gramEnd"/>
+    </w:p>
+    <w:p>
+      <w:r>
+        <w:t>•</w:t>
+      </w:r>
+      <w:r>
+        <w:tab/>
+      </w:r>
+      <w:proofErr w:type="spellStart"/>
+      <w:r>
+        <w:t>ca</w:t>
+      </w:r>
+      <w:proofErr w:type="spellEnd"/>
+    </w:p>
+    <w:p>
+      <w:r>
+        <w:t>•</w:t>
+      </w:r>
+      <w:r>
+        <w:tab/>
+      </w:r>
+      <w:proofErr w:type="spellStart"/>
+      <w:proofErr w:type="gramStart"/>
+      <w:r>
+        <w:t>thal</w:t>
+      </w:r>
+      <w:proofErr w:type="spellEnd"/>
+      <w:proofErr w:type="gramEnd"/>
+    </w:p>
+    <w:p/>
+    <w:p>
+      <w:r>
+        <w:t>PredictionResponse.java stores prediction outputs including:</w:t>
+      </w:r>
+    </w:p>
+    <w:p/>
+    <w:p>
+      <w:r>
+        <w:t>•</w:t>
+      </w:r>
+      <w:r>
+        <w:tab/>
+      </w:r>
+      <w:proofErr w:type="gramStart"/>
+      <w:r>
+        <w:t>prediction</w:t>
+      </w:r>
+      <w:proofErr w:type="gramEnd"/>
+    </w:p>
+    <w:p>
+      <w:r>
+        <w:t>•</w:t>
+      </w:r>
+      <w:r>
+        <w:tab/>
+      </w:r>
+      <w:proofErr w:type="gramStart"/>
+      <w:r>
+        <w:t>confidence</w:t>
+      </w:r>
+      <w:proofErr w:type="gramEnd"/>
+    </w:p>
+    <w:p>
+      <w:r>
+        <w:t>•</w:t>
+      </w:r>
+      <w:r>
+        <w:tab/>
+      </w:r>
+      <w:proofErr w:type="spellStart"/>
+      <w:r>
+        <w:t>risk_level</w:t>
+      </w:r>
+      <w:proofErr w:type="spellEnd"/>
+    </w:p>
+    <w:p>
+      <w:r>
+        <w:t>•</w:t>
+      </w:r>
+      <w:r>
+        <w:tab/>
+      </w:r>
+      <w:proofErr w:type="gramStart"/>
+      <w:r>
+        <w:t>message</w:t>
+      </w:r>
+      <w:proofErr w:type="gramEnd"/>
+    </w:p>
+    <w:p/>
+    <w:p>
+      <w:r>
+        <w:t>The DTO layer helps in transferring structured JSON data between backend services and APIs.</w:t>
+      </w:r>
+    </w:p>
+    <w:p/>
+    <w:p>
+      <w:r>
+        <w:t>________________________________________</w:t>
+      </w:r>
+    </w:p>
+    <w:p/>
+    <w:p>
+      <w:r>
+        <w:t>4. Flask API Integration</w:t>
+      </w:r>
+    </w:p>
+    <w:p/>
+    <w:p>
+      <w:r>
+        <w:t>Integration between Spring Boot backend and Flask Machine Learning API was successfully implemented.</w:t>
+      </w:r>
+    </w:p>
+    <w:p/>
+    <w:p>
+      <w:r>
+        <w:t xml:space="preserve">A separate class named FlaskApiClient.java was created inside the client package using </w:t>
+      </w:r>
+      <w:proofErr w:type="spellStart"/>
+      <w:r>
+        <w:t>RestTemplate</w:t>
+      </w:r>
+      <w:proofErr w:type="spellEnd"/>
+      <w:r>
+        <w:t xml:space="preserve"> for API communication.</w:t>
+      </w:r>
+    </w:p>
+    <w:p/>
+    <w:p>
+      <w:r>
+        <w:t>Responsibilities of FlaskApiClient.java:</w:t>
+      </w:r>
+    </w:p>
+    <w:p/>
+    <w:p>
+      <w:r>
+        <w:t>•</w:t>
+      </w:r>
+      <w:r>
+        <w:tab/>
+        <w:t>Send HTTP POST requests to Flask API</w:t>
+      </w:r>
+    </w:p>
+    <w:p>
+      <w:r>
+        <w:t>•</w:t>
+      </w:r>
+      <w:r>
+        <w:tab/>
+        <w:t>Transfer patient medical parameters</w:t>
+      </w:r>
+    </w:p>
+    <w:p>
+      <w:r>
+        <w:t>•</w:t>
+      </w:r>
+      <w:r>
+        <w:tab/>
+        <w:t>Receive JSON prediction responses</w:t>
+      </w:r>
+    </w:p>
+    <w:p>
+      <w:r>
+        <w:t>•</w:t>
+      </w:r>
+      <w:r>
+        <w:tab/>
+        <w:t>Convert JSON responses into Java objects</w:t>
+      </w:r>
+    </w:p>
+    <w:p/>
+    <w:p>
+      <w:r>
+        <w:t>Flask API Endpoint Used:</w:t>
+      </w:r>
+    </w:p>
+    <w:p/>
+    <w:p>
+      <w:r>
+        <w:t>http://127.0.0.1:5000/predict</w:t>
+      </w:r>
+    </w:p>
+    <w:p/>
+    <w:p>
+      <w:r>
+        <w:t>This integration enables communication between Java backend and Python Machine Learning engine.</w:t>
+      </w:r>
+    </w:p>
+    <w:p/>
+    <w:p>
+      <w:r>
+        <w:t>________________________________________</w:t>
+      </w:r>
+    </w:p>
+    <w:p/>
+    <w:p>
+      <w:r>
+        <w:t>5. Service Layer Development</w:t>
+      </w:r>
+    </w:p>
+    <w:p/>
+    <w:p>
+      <w:r>
+        <w:t>A service layer named PredictionService.java was developed to implement backend business logic.</w:t>
+      </w:r>
+    </w:p>
+    <w:p/>
+    <w:p>
+      <w:r>
+        <w:t>Responsibilities of PredictionService.java:</w:t>
+      </w:r>
+    </w:p>
+    <w:p/>
+    <w:p>
+      <w:r>
+        <w:t>•</w:t>
+      </w:r>
+      <w:r>
+        <w:tab/>
+        <w:t>Validate incoming request data</w:t>
+      </w:r>
+    </w:p>
+    <w:p>
+      <w:r>
+        <w:t>•</w:t>
+      </w:r>
+      <w:r>
+        <w:tab/>
+        <w:t>Process prediction requests</w:t>
+      </w:r>
+    </w:p>
+    <w:p>
+      <w:r>
+        <w:t>•</w:t>
+      </w:r>
+      <w:r>
+        <w:tab/>
+        <w:t>Communicate with Flask API client</w:t>
+      </w:r>
+    </w:p>
+    <w:p>
+      <w:r>
+        <w:t>•</w:t>
+      </w:r>
+      <w:r>
+        <w:tab/>
+        <w:t>Process prediction responses</w:t>
+      </w:r>
+    </w:p>
+    <w:p>
+      <w:r>
+        <w:t>•</w:t>
+      </w:r>
+      <w:r>
+        <w:tab/>
+        <w:t>Handle backend operations</w:t>
+      </w:r>
+    </w:p>
+    <w:p/>
+    <w:p>
+      <w:r>
+        <w:t>Basic validation checks were implemented for:</w:t>
+      </w:r>
+    </w:p>
+    <w:p/>
+    <w:p>
+      <w:r>
+        <w:t>•</w:t>
+      </w:r>
+      <w:r>
+        <w:tab/>
+        <w:t>Invalid age values</w:t>
+      </w:r>
+    </w:p>
+    <w:p>
+      <w:r>
+        <w:t>•</w:t>
+      </w:r>
+      <w:r>
+        <w:tab/>
+        <w:t>Invalid cholesterol values</w:t>
+      </w:r>
+    </w:p>
+    <w:p/>
+    <w:p>
+      <w:r>
+        <w:t>The service layer improves backend modularity and separates business logic from controller logic.</w:t>
+      </w:r>
+    </w:p>
+    <w:p/>
+    <w:p>
+      <w:r>
+        <w:t>________________________________________</w:t>
+      </w:r>
+    </w:p>
+    <w:p/>
+    <w:p>
+      <w:r>
+        <w:t>6. REST Controller Development</w:t>
+      </w:r>
+    </w:p>
+    <w:p/>
+    <w:p>
+      <w:r>
+        <w:t>REST API controller development was successfully completed using Spring Boot annotations.</w:t>
+      </w:r>
+    </w:p>
+    <w:p/>
+    <w:p>
+      <w:r>
+        <w:t>A controller class named PredictionController.java was created to expose backend endpoints.</w:t>
+      </w:r>
+    </w:p>
+    <w:p/>
+    <w:p>
+      <w:r>
+        <w:t>The following endpoint was developed:</w:t>
+      </w:r>
+    </w:p>
+    <w:p/>
+    <w:p>
+      <w:r>
+        <w:t>POST /</w:t>
+      </w:r>
+      <w:proofErr w:type="spellStart"/>
+      <w:r>
+        <w:t>api</w:t>
+      </w:r>
+      <w:proofErr w:type="spellEnd"/>
+      <w:r>
+        <w:t>/predict</w:t>
+      </w:r>
+    </w:p>
+    <w:p/>
+    <w:p>
+      <w:r>
+        <w:t>Responsibilities of the Controller:</w:t>
+      </w:r>
+    </w:p>
+    <w:p/>
+    <w:p>
+      <w:r>
+        <w:t>•</w:t>
+      </w:r>
+      <w:r>
+        <w:tab/>
+        <w:t>Accept prediction requests</w:t>
+      </w:r>
+    </w:p>
+    <w:p>
+      <w:r>
+        <w:t>•</w:t>
+      </w:r>
+      <w:r>
+        <w:tab/>
+        <w:t>Receive patient JSON data</w:t>
+      </w:r>
+    </w:p>
+    <w:p>
+      <w:r>
+        <w:t>•</w:t>
+      </w:r>
+      <w:r>
+        <w:tab/>
+        <w:t>Call backend service layer</w:t>
+      </w:r>
+    </w:p>
+    <w:p>
+      <w:r>
+        <w:t>•</w:t>
+      </w:r>
+      <w:r>
+        <w:tab/>
+        <w:t>Return prediction responses</w:t>
+      </w:r>
+    </w:p>
+    <w:p/>
+    <w:p>
+      <w:r>
+        <w:t>Spring Boot annotations used:</w:t>
+      </w:r>
+    </w:p>
+    <w:p/>
+    <w:p>
+      <w:r>
+        <w:t>•</w:t>
+      </w:r>
+      <w:r>
+        <w:tab/>
+        <w:t>@</w:t>
+      </w:r>
+      <w:proofErr w:type="spellStart"/>
+      <w:r>
+        <w:t>RestController</w:t>
+      </w:r>
+      <w:proofErr w:type="spellEnd"/>
+    </w:p>
+    <w:p>
+      <w:r>
+        <w:t>•</w:t>
+      </w:r>
+      <w:r>
+        <w:tab/>
+        <w:t>@</w:t>
+      </w:r>
+      <w:proofErr w:type="spellStart"/>
+      <w:r>
+        <w:t>RequestMapping</w:t>
+      </w:r>
+      <w:proofErr w:type="spellEnd"/>
+    </w:p>
+    <w:p>
+      <w:r>
+        <w:lastRenderedPageBreak/>
+        <w:t>•</w:t>
+      </w:r>
+      <w:r>
+        <w:tab/>
+        <w:t>@</w:t>
+      </w:r>
+      <w:proofErr w:type="spellStart"/>
+      <w:r>
+        <w:t>PostMapping</w:t>
+      </w:r>
+      <w:proofErr w:type="spellEnd"/>
+    </w:p>
+    <w:p>
+      <w:r>
+        <w:t>•</w:t>
+      </w:r>
+      <w:r>
+        <w:tab/>
+        <w:t>@</w:t>
+      </w:r>
+      <w:proofErr w:type="spellStart"/>
+      <w:r>
+        <w:t>RequestBody</w:t>
+      </w:r>
+      <w:proofErr w:type="spellEnd"/>
+    </w:p>
+    <w:p>
+      <w:r>
+        <w:t>•</w:t>
+      </w:r>
+      <w:r>
+        <w:tab/>
+        <w:t>@</w:t>
+      </w:r>
+      <w:proofErr w:type="spellStart"/>
+      <w:r>
+        <w:t>CrossOrigin</w:t>
+      </w:r>
+      <w:proofErr w:type="spellEnd"/>
+    </w:p>
+    <w:p>
+      <w:r>
+        <w:t>•</w:t>
+      </w:r>
+      <w:r>
+        <w:tab/>
+        <w:t>@Service</w:t>
+      </w:r>
+    </w:p>
+    <w:p>
+      <w:r>
+        <w:t>•</w:t>
+      </w:r>
+      <w:r>
+        <w:tab/>
+        <w:t>@Component</w:t>
+      </w:r>
+    </w:p>
+    <w:p/>
+    <w:p>
+      <w:r>
+        <w:t>The controller layer acts as the entry point for prediction requests.</w:t>
+      </w:r>
+    </w:p>
+    <w:p/>
+    <w:p>
+      <w:r>
+        <w:t>________________________________________</w:t>
+      </w:r>
+    </w:p>
+    <w:p/>
+    <w:p>
+      <w:r>
+        <w:t>7. Backend Integration Testing</w:t>
+      </w:r>
+    </w:p>
+    <w:p/>
+    <w:p>
+      <w:r>
+        <w:t>Complete backend integration testing was successfully performed using:</w:t>
+      </w:r>
+    </w:p>
+    <w:p/>
+    <w:p>
+      <w:r>
+        <w:t>•</w:t>
+      </w:r>
+      <w:r>
+        <w:tab/>
+        <w:t>Postman</w:t>
+      </w:r>
+    </w:p>
+    <w:p>
+      <w:r>
+        <w:t>•</w:t>
+      </w:r>
+      <w:r>
+        <w:tab/>
+        <w:t>Spring Boot</w:t>
+      </w:r>
+    </w:p>
+    <w:p>
+      <w:r>
+        <w:t>•</w:t>
+      </w:r>
+      <w:r>
+        <w:tab/>
+        <w:t>Flask API</w:t>
+      </w:r>
+    </w:p>
+    <w:p>
+      <w:r>
+        <w:t>•</w:t>
+      </w:r>
+      <w:r>
+        <w:tab/>
+        <w:t>Machine Learning Model (.</w:t>
+      </w:r>
+      <w:proofErr w:type="spellStart"/>
+      <w:r>
+        <w:t>pkl</w:t>
+      </w:r>
+      <w:proofErr w:type="spellEnd"/>
+      <w:r>
+        <w:t>)</w:t>
+      </w:r>
+    </w:p>
+    <w:p/>
+    <w:p>
+      <w:r>
+        <w:t>Backend Testing Flow:</w:t>
+      </w:r>
+    </w:p>
+    <w:p/>
+    <w:p>
+      <w:r>
+        <w:t>Postman</w:t>
+      </w:r>
+    </w:p>
+    <w:p>
+      <w:r>
+        <w:t>↓</w:t>
+      </w:r>
+    </w:p>
+    <w:p>
+      <w:r>
+        <w:t>Spring Boot Controller</w:t>
+      </w:r>
+    </w:p>
+    <w:p>
+      <w:r>
+        <w:t>↓</w:t>
+      </w:r>
+    </w:p>
+    <w:p>
+      <w:r>
+        <w:t>Prediction Service</w:t>
+      </w:r>
+    </w:p>
+    <w:p>
+      <w:r>
+        <w:t>↓</w:t>
+      </w:r>
+    </w:p>
+    <w:p>
+      <w:r>
+        <w:t>Flask API Client</w:t>
+      </w:r>
+    </w:p>
+    <w:p>
+      <w:r>
+        <w:t>↓</w:t>
+      </w:r>
+    </w:p>
+    <w:p>
+      <w:r>
+        <w:lastRenderedPageBreak/>
+        <w:t>Flask ML API</w:t>
+      </w:r>
+    </w:p>
+    <w:p>
+      <w:r>
+        <w:t>↓</w:t>
+      </w:r>
+    </w:p>
+    <w:p>
+      <w:r>
+        <w:t>Machine Learning Model (.</w:t>
+      </w:r>
+      <w:proofErr w:type="spellStart"/>
+      <w:r>
+        <w:t>pkl</w:t>
+      </w:r>
+      <w:proofErr w:type="spellEnd"/>
+      <w:r>
+        <w:t>)</w:t>
+      </w:r>
+    </w:p>
+    <w:p/>
+    <w:p>
+      <w:r>
+        <w:t>Sample Request:</w:t>
+      </w:r>
+    </w:p>
+    <w:p/>
+    <w:p>
+      <w:r>
+        <w:t>{</w:t>
+      </w:r>
+    </w:p>
+    <w:p>
+      <w:r>
+        <w:t xml:space="preserve">  "</w:t>
+      </w:r>
+      <w:proofErr w:type="gramStart"/>
+      <w:r>
+        <w:t>age</w:t>
+      </w:r>
+      <w:proofErr w:type="gramEnd"/>
+      <w:r>
+        <w:t>": 52,</w:t>
+      </w:r>
+    </w:p>
+    <w:p>
+      <w:r>
+        <w:t xml:space="preserve">  "</w:t>
+      </w:r>
+      <w:proofErr w:type="gramStart"/>
+      <w:r>
+        <w:t>sex</w:t>
+      </w:r>
+      <w:proofErr w:type="gramEnd"/>
+      <w:r>
+        <w:t>": 1,</w:t>
+      </w:r>
+    </w:p>
+    <w:p>
+      <w:r>
+        <w:t xml:space="preserve">  "</w:t>
+      </w:r>
+      <w:proofErr w:type="spellStart"/>
+      <w:proofErr w:type="gramStart"/>
+      <w:r>
+        <w:t>cp</w:t>
+      </w:r>
+      <w:proofErr w:type="spellEnd"/>
+      <w:proofErr w:type="gramEnd"/>
+      <w:r>
+        <w:t>": 0,</w:t>
+      </w:r>
+    </w:p>
+    <w:p>
+      <w:r>
+        <w:t xml:space="preserve">  "</w:t>
+      </w:r>
+      <w:proofErr w:type="spellStart"/>
+      <w:proofErr w:type="gramStart"/>
+      <w:r>
+        <w:t>trestbps</w:t>
+      </w:r>
+      <w:proofErr w:type="spellEnd"/>
+      <w:proofErr w:type="gramEnd"/>
+      <w:r>
+        <w:t>": 125,</w:t>
+      </w:r>
+    </w:p>
+    <w:p>
+      <w:r>
+        <w:t xml:space="preserve">  "</w:t>
+      </w:r>
+      <w:proofErr w:type="spellStart"/>
+      <w:proofErr w:type="gramStart"/>
+      <w:r>
+        <w:t>chol</w:t>
+      </w:r>
+      <w:proofErr w:type="spellEnd"/>
+      <w:proofErr w:type="gramEnd"/>
+      <w:r>
+        <w:t>": 212,</w:t>
+      </w:r>
+    </w:p>
+    <w:p>
+      <w:r>
+        <w:t xml:space="preserve">  "</w:t>
+      </w:r>
+      <w:proofErr w:type="spellStart"/>
+      <w:proofErr w:type="gramStart"/>
+      <w:r>
+        <w:t>fbs</w:t>
+      </w:r>
+      <w:proofErr w:type="spellEnd"/>
+      <w:proofErr w:type="gramEnd"/>
+      <w:r>
+        <w:t>": 0,</w:t>
+      </w:r>
+    </w:p>
+    <w:p>
+      <w:r>
+        <w:t xml:space="preserve">  "</w:t>
+      </w:r>
+      <w:proofErr w:type="spellStart"/>
+      <w:proofErr w:type="gramStart"/>
+      <w:r>
+        <w:t>restecg</w:t>
+      </w:r>
+      <w:proofErr w:type="spellEnd"/>
+      <w:proofErr w:type="gramEnd"/>
+      <w:r>
+        <w:t>": 1,</w:t>
+      </w:r>
+    </w:p>
+    <w:p>
+      <w:r>
+        <w:t xml:space="preserve">  "</w:t>
+      </w:r>
+      <w:proofErr w:type="spellStart"/>
+      <w:proofErr w:type="gramStart"/>
+      <w:r>
+        <w:t>thalach</w:t>
+      </w:r>
+      <w:proofErr w:type="spellEnd"/>
+      <w:proofErr w:type="gramEnd"/>
+      <w:r>
+        <w:t>": 168,</w:t>
+      </w:r>
+    </w:p>
+    <w:p>
+      <w:r>
+        <w:t xml:space="preserve">  "</w:t>
+      </w:r>
+      <w:proofErr w:type="spellStart"/>
+      <w:proofErr w:type="gramStart"/>
+      <w:r>
+        <w:t>exang</w:t>
+      </w:r>
+      <w:proofErr w:type="spellEnd"/>
+      <w:proofErr w:type="gramEnd"/>
+      <w:r>
+        <w:t>": 0,</w:t>
+      </w:r>
+    </w:p>
+    <w:p>
+      <w:r>
+        <w:t xml:space="preserve">  "</w:t>
+      </w:r>
+      <w:proofErr w:type="spellStart"/>
+      <w:proofErr w:type="gramStart"/>
+      <w:r>
+        <w:t>oldpeak</w:t>
+      </w:r>
+      <w:proofErr w:type="spellEnd"/>
+      <w:proofErr w:type="gramEnd"/>
+      <w:r>
+        <w:t>": 1.0,</w:t>
+      </w:r>
+    </w:p>
+    <w:p>
+      <w:r>
+        <w:t xml:space="preserve">  "</w:t>
+      </w:r>
+      <w:proofErr w:type="gramStart"/>
+      <w:r>
+        <w:t>slope</w:t>
+      </w:r>
+      <w:proofErr w:type="gramEnd"/>
+      <w:r>
+        <w:t>": 2,</w:t>
+      </w:r>
+    </w:p>
+    <w:p>
+      <w:r>
+        <w:t xml:space="preserve">  "</w:t>
+      </w:r>
+      <w:proofErr w:type="spellStart"/>
+      <w:r>
+        <w:t>ca</w:t>
+      </w:r>
+      <w:proofErr w:type="spellEnd"/>
+      <w:r>
+        <w:t>": 2,</w:t>
+      </w:r>
+    </w:p>
+    <w:p>
+      <w:r>
+        <w:t xml:space="preserve">  "</w:t>
+      </w:r>
+      <w:proofErr w:type="spellStart"/>
+      <w:proofErr w:type="gramStart"/>
+      <w:r>
+        <w:t>thal</w:t>
+      </w:r>
+      <w:proofErr w:type="spellEnd"/>
+      <w:proofErr w:type="gramEnd"/>
+      <w:r>
+        <w:t>": 3</w:t>
+      </w:r>
+    </w:p>
+    <w:p>
+      <w:r>
+        <w:t>}</w:t>
+      </w:r>
+    </w:p>
+    <w:p/>
+    <w:p>
+      <w:r>
+        <w:t>Sample Response:</w:t>
+      </w:r>
+    </w:p>
+    <w:p/>
+    <w:p>
+      <w:r>
+        <w:t>{</w:t>
+      </w:r>
+    </w:p>
+    <w:p>
+      <w:r>
+        <w:t xml:space="preserve">  "</w:t>
+      </w:r>
+      <w:proofErr w:type="gramStart"/>
+      <w:r>
+        <w:t>confidence</w:t>
+      </w:r>
+      <w:proofErr w:type="gramEnd"/>
+      <w:r>
+        <w:t>": 0.3,</w:t>
+      </w:r>
+    </w:p>
+    <w:p>
+      <w:r>
+        <w:t xml:space="preserve">  "</w:t>
+      </w:r>
+      <w:proofErr w:type="gramStart"/>
+      <w:r>
+        <w:t>message</w:t>
+      </w:r>
+      <w:proofErr w:type="gramEnd"/>
+      <w:r>
+        <w:t>": "Prediction generated successfully",</w:t>
+      </w:r>
+    </w:p>
+    <w:p>
+      <w:r>
+        <w:t xml:space="preserve">  "</w:t>
+      </w:r>
+      <w:proofErr w:type="gramStart"/>
+      <w:r>
+        <w:t>prediction</w:t>
+      </w:r>
+      <w:proofErr w:type="gramEnd"/>
+      <w:r>
+        <w:t>": 0,</w:t>
+      </w:r>
+    </w:p>
+    <w:p>
+      <w:r>
+        <w:t xml:space="preserve">  "</w:t>
+      </w:r>
+      <w:proofErr w:type="spellStart"/>
+      <w:r>
+        <w:t>risk_level</w:t>
+      </w:r>
+      <w:proofErr w:type="spellEnd"/>
+      <w:r>
+        <w:t>": "Low Risk"</w:t>
+      </w:r>
+    </w:p>
+    <w:p>
+      <w:r>
+        <w:lastRenderedPageBreak/>
+        <w:t>}</w:t>
+      </w:r>
+    </w:p>
+    <w:p/>
+    <w:p>
+      <w:r>
+        <w:t>The complete backend-to-ML integration flow was successfully verified.</w:t>
+      </w:r>
+    </w:p>
+    <w:p/>
+    <w:p>
+      <w:r>
+        <w:t>________________________________________</w:t>
+      </w:r>
+    </w:p>
+    <w:p/>
+    <w:p>
+      <w:r>
+        <w:t>8. Exception Handling</w:t>
+      </w:r>
+    </w:p>
+    <w:p/>
+    <w:p>
+      <w:r>
+        <w:t>Backend exception handling was implemented to improve system reliability and prevent backend crashes.</w:t>
+      </w:r>
+    </w:p>
+    <w:p/>
+    <w:p>
+      <w:r>
+        <w:t>The backend was designed to handle:</w:t>
+      </w:r>
+    </w:p>
+    <w:p/>
+    <w:p>
+      <w:r>
+        <w:t>•</w:t>
+      </w:r>
+      <w:r>
+        <w:tab/>
+        <w:t>Flask API unavailable errors</w:t>
+      </w:r>
+    </w:p>
+    <w:p>
+      <w:r>
+        <w:t>•</w:t>
+      </w:r>
+      <w:r>
+        <w:tab/>
+        <w:t>Null responses</w:t>
+      </w:r>
+    </w:p>
+    <w:p>
+      <w:r>
+        <w:t>•</w:t>
+      </w:r>
+      <w:r>
+        <w:tab/>
+        <w:t>Invalid input values</w:t>
+      </w:r>
+    </w:p>
+    <w:p>
+      <w:r>
+        <w:t>•</w:t>
+      </w:r>
+      <w:r>
+        <w:tab/>
+        <w:t>Runtime exceptions</w:t>
+      </w:r>
+    </w:p>
+    <w:p/>
+    <w:p>
+      <w:r>
+        <w:t>Controlled error responses were added to improve backend stability and user experience.</w:t>
+      </w:r>
+    </w:p>
+    <w:p/>
+    <w:p>
+      <w:r>
+        <w:t>________________________________________</w:t>
+      </w:r>
+    </w:p>
+    <w:p/>
+    <w:p>
+      <w:r>
+        <w:t>9. Configuration Management</w:t>
+      </w:r>
+    </w:p>
+    <w:p/>
+    <w:p>
+      <w:r>
+        <w:t xml:space="preserve">Backend configuration management was implemented using the </w:t>
+      </w:r>
+      <w:proofErr w:type="spellStart"/>
+      <w:r>
+        <w:t>application.properties</w:t>
+      </w:r>
+      <w:proofErr w:type="spellEnd"/>
+      <w:r>
+        <w:t xml:space="preserve"> file.</w:t>
+      </w:r>
+    </w:p>
+    <w:p/>
+    <w:p>
+      <w:r>
+        <w:t>Configurations Added:</w:t>
+      </w:r>
+    </w:p>
+    <w:p/>
+    <w:p>
+      <w:r>
+        <w:t>•</w:t>
+      </w:r>
+      <w:r>
+        <w:tab/>
+      </w:r>
+      <w:proofErr w:type="spellStart"/>
+      <w:r>
+        <w:t>server.port</w:t>
+      </w:r>
+      <w:proofErr w:type="spellEnd"/>
+      <w:r>
+        <w:t>=8080</w:t>
+      </w:r>
+    </w:p>
+    <w:p>
+      <w:r>
+        <w:lastRenderedPageBreak/>
+        <w:t>•</w:t>
+      </w:r>
+      <w:r>
+        <w:tab/>
+        <w:t>flask.api.url=http://127.0.0.1:5000/predict</w:t>
+      </w:r>
+    </w:p>
+    <w:p/>
+    <w:p>
+      <w:r>
+        <w:t>Purpose of Configuration Management:</w:t>
+      </w:r>
+    </w:p>
+    <w:p/>
+    <w:p>
+      <w:r>
+        <w:t>•</w:t>
+      </w:r>
+      <w:r>
+        <w:tab/>
+        <w:t>Remove hardcoded backend configurations</w:t>
+      </w:r>
+    </w:p>
+    <w:p>
+      <w:r>
+        <w:t>•</w:t>
+      </w:r>
+      <w:r>
+        <w:tab/>
+        <w:t>Improve maintainability</w:t>
+      </w:r>
+    </w:p>
+    <w:p>
+      <w:r>
+        <w:t>•</w:t>
+      </w:r>
+      <w:r>
+        <w:tab/>
+        <w:t>Allow flexible backend configuration changes</w:t>
+      </w:r>
+    </w:p>
+    <w:p/>
+    <w:p>
+      <w:r>
+        <w:t>This approach improves scalability and backend flexibility.</w:t>
+      </w:r>
+    </w:p>
+    <w:p/>
+    <w:p>
+      <w:r>
+        <w:t>________________________________________</w:t>
+      </w:r>
+    </w:p>
+    <w:p/>
+    <w:p>
+      <w:r>
+        <w:t>10. Result Model Preparation</w:t>
+      </w:r>
+    </w:p>
+    <w:p/>
+    <w:p>
+      <w:r>
+        <w:t>A backend model class named PredictionResult.java was developed to prepare the system for future database integration.</w:t>
+      </w:r>
+    </w:p>
+    <w:p/>
+    <w:p>
+      <w:r>
+        <w:t>The model contains fields including:</w:t>
+      </w:r>
+    </w:p>
+    <w:p/>
+    <w:p>
+      <w:r>
+        <w:t>•</w:t>
+      </w:r>
+      <w:r>
+        <w:tab/>
+      </w:r>
+      <w:proofErr w:type="gramStart"/>
+      <w:r>
+        <w:t>id</w:t>
+      </w:r>
+      <w:proofErr w:type="gramEnd"/>
+    </w:p>
+    <w:p>
+      <w:r>
+        <w:t>•</w:t>
+      </w:r>
+      <w:r>
+        <w:tab/>
+      </w:r>
+      <w:proofErr w:type="gramStart"/>
+      <w:r>
+        <w:t>age</w:t>
+      </w:r>
+      <w:proofErr w:type="gramEnd"/>
+    </w:p>
+    <w:p>
+      <w:r>
+        <w:t>•</w:t>
+      </w:r>
+      <w:r>
+        <w:tab/>
+      </w:r>
+      <w:proofErr w:type="gramStart"/>
+      <w:r>
+        <w:t>sex</w:t>
+      </w:r>
+      <w:proofErr w:type="gramEnd"/>
+    </w:p>
+    <w:p>
+      <w:r>
+        <w:t>•</w:t>
+      </w:r>
+      <w:r>
+        <w:tab/>
+      </w:r>
+      <w:proofErr w:type="spellStart"/>
+      <w:proofErr w:type="gramStart"/>
+      <w:r>
+        <w:t>chol</w:t>
+      </w:r>
+      <w:proofErr w:type="spellEnd"/>
+      <w:proofErr w:type="gramEnd"/>
+    </w:p>
+    <w:p>
+      <w:r>
+        <w:t>•</w:t>
+      </w:r>
+      <w:r>
+        <w:tab/>
+      </w:r>
+      <w:proofErr w:type="gramStart"/>
+      <w:r>
+        <w:t>prediction</w:t>
+      </w:r>
+      <w:proofErr w:type="gramEnd"/>
+    </w:p>
+    <w:p>
+      <w:r>
+        <w:t>•</w:t>
+      </w:r>
+      <w:r>
+        <w:tab/>
+      </w:r>
+      <w:proofErr w:type="gramStart"/>
+      <w:r>
+        <w:t>confidence</w:t>
+      </w:r>
+      <w:proofErr w:type="gramEnd"/>
+    </w:p>
+    <w:p>
+      <w:r>
+        <w:t>•</w:t>
+      </w:r>
+      <w:r>
+        <w:tab/>
+      </w:r>
+      <w:proofErr w:type="spellStart"/>
+      <w:proofErr w:type="gramStart"/>
+      <w:r>
+        <w:t>riskLevel</w:t>
+      </w:r>
+      <w:proofErr w:type="spellEnd"/>
+      <w:proofErr w:type="gramEnd"/>
+    </w:p>
+    <w:p>
+      <w:r>
+        <w:t>•</w:t>
+      </w:r>
+      <w:r>
+        <w:tab/>
+      </w:r>
+      <w:proofErr w:type="spellStart"/>
+      <w:proofErr w:type="gramStart"/>
+      <w:r>
+        <w:t>predictionTime</w:t>
+      </w:r>
+      <w:proofErr w:type="spellEnd"/>
+      <w:proofErr w:type="gramEnd"/>
+    </w:p>
+    <w:p/>
+    <w:p>
+      <w:r>
+        <w:t>The model structure will later be used for storing prediction history and database records.</w:t>
+      </w:r>
+    </w:p>
+    <w:p/>
+    <w:p>
+      <w:r>
+        <w:t>________________________________________</w:t>
+      </w:r>
+    </w:p>
+    <w:p/>
+    <w:p>
+      <w:r>
+        <w:t>11. Technologies Used</w:t>
+      </w:r>
+    </w:p>
+    <w:p/>
+    <w:p>
+      <w:r>
+        <w:t>The following technologies were used during backend development:</w:t>
+      </w:r>
+    </w:p>
+    <w:p/>
+    <w:p>
+      <w:r>
+        <w:t>•</w:t>
+      </w:r>
+      <w:r>
+        <w:tab/>
+        <w:t>Java 21</w:t>
+      </w:r>
+    </w:p>
+    <w:p>
+      <w:r>
+        <w:t>•</w:t>
+      </w:r>
+      <w:r>
+        <w:tab/>
+        <w:t>Spring Boot</w:t>
+      </w:r>
+    </w:p>
+    <w:p>
+      <w:r>
+        <w:t>•</w:t>
+      </w:r>
+      <w:r>
+        <w:tab/>
+        <w:t>Maven</w:t>
+      </w:r>
+    </w:p>
+    <w:p>
+      <w:r>
+        <w:t>•</w:t>
+      </w:r>
+      <w:r>
+        <w:tab/>
+        <w:t>REST API</w:t>
+      </w:r>
+    </w:p>
+    <w:p>
+      <w:r>
+        <w:t>•</w:t>
+      </w:r>
+      <w:r>
+        <w:tab/>
+        <w:t>Flask</w:t>
+      </w:r>
+    </w:p>
+    <w:p>
+      <w:r>
+        <w:t>•</w:t>
+      </w:r>
+      <w:r>
+        <w:tab/>
+        <w:t>Postman</w:t>
+      </w:r>
+    </w:p>
+    <w:p/>
+    <w:p>
+      <w:r>
+        <w:t>________________________________________</w:t>
+      </w:r>
+    </w:p>
+    <w:p/>
+    <w:p>
+      <w:r>
+        <w:t>12. Conclusion</w:t>
+      </w:r>
+    </w:p>
+    <w:p/>
+    <w:p>
+      <w:r>
+        <w:t>The Spring Boot backend development phase was successfully completed for the AI-Based Artery Blockage Prediction System. A clean layered backend architecture was developed and integrated successfully with the Flask Machine Learning API. The backend is now capable of receiving patient data, communicating with the ML engine, processing prediction responses, handling exceptions, and returning artery blockage prediction results successfully.</w:t>
+      </w:r>
+    </w:p>
+    <w:p/>
     <w:p>
       <w:bookmarkStart w:id="0" w:name="_GoBack"/>
       <w:bookmarkEnd w:id="0"/>

</xml_diff>